<commit_message>
Memo v4: apply blind-review fixes; add BLIND_REVIEW.md; log on WORKBOARD
- AI rebuttal reframed (agent = one-time conversion feature; Muse is share risk); 4Q guide miss defined vs the Street
- FX added to the illusion; n=3 post-print sentence removed; return -20.7% on $120; NTM decomposition
- Graph 1 takeaway matches the chart (~7-8% in 2H26, ~6% by 2H27); page fit re-checked (Carlito 715pt vs 745pt original)

Co-Authored-By: Claude Opus 5.5 <noreply@anthropic.com>
Claude-Session: https://claude.ai/code/session_01TzpvBq4n9kKKg9diq1w4FQ
</commit_message>
<xml_diff>
--- a/deck/drafts/memo_v4_pm_feedback_2026-09-29/ABNB_Citadel_Pitch_Memo_v4.docx
+++ b/deck/drafts/memo_v4_pm_feedback_2026-09-29/ABNB_Citadel_Pitch_Memo_v4.docx
@@ -92,7 +92,7 @@
           <w:sz w:val="22"/>
           <w:szCs w:val="22"/>
         </w:rPr>
-        <w:t xml:space="preserve">−20.6%</w:t>
+        <w:t xml:space="preserve">−20.7%</w:t>
       </w:r>
       <w:r>
         <w:rPr>
@@ -234,15 +234,15 @@
           <w:sz w:val="22"/>
           <w:szCs w:val="22"/>
         </w:rPr>
-        <w:t xml:space="preserve">−20.6%</w:t>
-      </w:r>
-      <w:r>
-        <w:rPr>
-          <w:rFonts w:ascii="Aptos" w:cs="Aptos" w:eastAsia="Aptos" w:hAnsi="Aptos"/>
-          <w:sz w:val="22"/>
-          <w:szCs w:val="22"/>
-        </w:rPr>
-        <w:t xml:space="preserve"> over 12 months. The market has missed one fact: Airbnb's growth has slowed every year since 2022, and its 2026 re-acceleration was bought, not earned. A one-time bundle of booking features added ~3pts of nights growth on top of an underlying ~7% that is heading to ~6%, and that lift now laps. The </w:t>
+        <w:t xml:space="preserve">−20.7%</w:t>
+      </w:r>
+      <w:r>
+        <w:rPr>
+          <w:rFonts w:ascii="Aptos" w:cs="Aptos" w:eastAsia="Aptos" w:hAnsi="Aptos"/>
+          <w:sz w:val="22"/>
+          <w:szCs w:val="22"/>
+        </w:rPr>
+        <w:t xml:space="preserve"> over 12 months. The market has missed one fact: Airbnb's growth has slowed every year since 2022, and its 2026 re-acceleration was bought, not earned. A one-time bundle of booking features, plus FX, dressed up underlying nights growth of ~7% that is heading to ~6% by 2H27, and the bundle now laps. The </w:t>
       </w:r>
       <w:r>
         <w:rPr>
@@ -404,7 +404,7 @@
           <w:sz w:val="22"/>
           <w:szCs w:val="22"/>
         </w:rPr>
-        <w:t xml:space="preserve">. Lower estimates at the lower multiple that slower growth earns give $120. ABNB is a liquid $89B large cap with low short interest, and the thesis plays out through estimate cuts over several prints, not one binary event, so the position can be sized.</w:t>
+        <w:t xml:space="preserve">. About half the downside is lower estimates, half the lower multiple that slower growth earns. In a liquid $89B large cap with low short interest, and with the thesis playing out through estimate cuts over several prints rather than one binary event, the position can be sized.</w:t>
       </w:r>
     </w:p>
     <w:p>
@@ -518,7 +518,7 @@
           <w:sz w:val="22"/>
           <w:szCs w:val="22"/>
         </w:rPr>
-        <w:t xml:space="preserve"> in 2Q25. Management answered with a bundle of conversion features: Reserve Now, Pay Later (RNPL: $0 at booking, Aug 2025), 14-day free cancellation and a 15.5% host-only fee (Oct 2025). Nights re-accelerated for five straight quarters to </w:t>
+        <w:t xml:space="preserve"> in 2Q25. Management answered with a bundle of conversion features: Reserve Now, Pay Later (RNPL: $0 at booking, Aug 2025), 14-day free cancellation and a 15.5% host-only fee (Oct 2025). Nights re-accelerated to </w:t>
       </w:r>
       <w:r>
         <w:rPr>
@@ -536,7 +536,7 @@
           <w:sz w:val="22"/>
           <w:szCs w:val="22"/>
         </w:rPr>
-        <w:t xml:space="preserve"> in 2Q26, and the stock rose </w:t>
+        <w:t xml:space="preserve"> in 2Q26, FX added 3–4pts to reported revenue growth in 1H26, and the stock rose </w:t>
       </w:r>
       <w:r>
         <w:rPr>
@@ -632,7 +632,7 @@
           <w:sz w:val="22"/>
           <w:szCs w:val="22"/>
         </w:rPr>
-        <w:t xml:space="preserve">, treating the bundle's one-time lift as lasting demand. The 23 Sep sell-off (−7.6%, when Expedia announced an integration with Meta's Muse AI agent) cut the multiple, not the estimates: LSEG's FY27 numbers were unchanged when re-pulled that day. Our variant view is on the estimates.</w:t>
+        <w:t xml:space="preserve">, treating the bundle's one-time lift as lasting demand. The 23 Sep sell-off (−7.6%, when Expedia announced an integration with Meta's Muse AI agent) cut the multiple, not the estimates: LSEG's FY27 numbers were unchanged when re-pulled that day.</w:t>
       </w:r>
     </w:p>
     <w:tbl>
@@ -809,7 +809,7 @@
           <w:sz w:val="22"/>
           <w:szCs w:val="22"/>
         </w:rPr>
-        <w:t xml:space="preserve"> A conversion feature raises the level of bookings once, so it lifts the growth rate only until it laps: US RNPL in 3Q26, the cancellation and fee legs in 4Q26, RNPL outside the US in 1Q–2Q27. RNPL has also stopped spreading: "roughly 20%" of GBV in 1Q26, when guests outside the US had it for only part of the quarter, and only "over 20%" in its first full global quarter. The cost arrives later. RNPL bookings "have experienced higher cancellation rates" (2Q26 10-Q), and the CFO put the platform rate at "maybe 16%… going to 17%", which implies </w:t>
+        <w:t xml:space="preserve"> A conversion feature raises the level of bookings once, so it lifts the growth rate only until it laps: US RNPL in 3Q26, the cancellation and fee legs in 4Q26, RNPL outside the US in 1Q–2Q27. RNPL has also stopped spreading: "roughly 20%" of GBV in 1Q26 with partial global access, only "over 20%" in its first full global quarter. The cost arrives later. RNPL bookings "have experienced higher cancellation rates" (2Q26 10-Q), and the CFO put the platform rate at "maybe 16%… going to 17%", which implies </w:t>
       </w:r>
       <w:r>
         <w:rPr>
@@ -953,7 +953,7 @@
           <w:sz w:val="22"/>
           <w:szCs w:val="22"/>
         </w:rPr>
-        <w:t xml:space="preserve"> for FY27.</w:t>
+        <w:t xml:space="preserve"> for FY27, while FX, a tailwind all of 2026, fades from 4Q26.</w:t>
       </w:r>
     </w:p>
     <w:p>
@@ -1031,7 +1031,7 @@
           <w:sz w:val="22"/>
           <w:szCs w:val="22"/>
         </w:rPr>
-        <w:t xml:space="preserve">; a two-parameter mapping frozen on pre-RNPL history turns that into </w:t>
+        <w:t xml:space="preserve"> (reviews through August); a two-parameter mapping frozen on pre-RNPL history turns that into </w:t>
       </w:r>
       <w:r>
         <w:rPr>
@@ -1067,7 +1067,7 @@
           <w:sz w:val="22"/>
           <w:szCs w:val="22"/>
         </w:rPr>
-        <w:t xml:space="preserve"> the error of a naive forecast in both backtest windows (Graph 2). Twelve external series (STR hotel RevPAR fading from +8.2% in July to ~4% by mid-August, Eurostat, BLS, INE, EUROCONTROL flights) read </w:t>
+        <w:t xml:space="preserve"> the error of a naive forecast in both backtest windows (Graph 2). Twelve external series (hotels, flights, national statistics; STR RevPAR faded from +8.2% in July to ~4% by mid-August) read </w:t>
       </w:r>
       <w:r>
         <w:rPr>
@@ -1085,25 +1085,7 @@
           <w:sz w:val="22"/>
           <w:szCs w:val="22"/>
         </w:rPr>
-        <w:t xml:space="preserve">. Every route lands below the lowest Street estimate; our model gives an </w:t>
-      </w:r>
-      <w:r>
-        <w:rPr>
-          <w:rFonts w:ascii="Aptos" w:cs="Aptos" w:eastAsia="Aptos" w:hAnsi="Aptos"/>
-          <w:b/>
-          <w:bCs/>
-          <w:sz w:val="22"/>
-          <w:szCs w:val="22"/>
-        </w:rPr>
-        <w:t xml:space="preserve">8%</w:t>
-      </w:r>
-      <w:r>
-        <w:rPr>
-          <w:rFonts w:ascii="Aptos" w:cs="Aptos" w:eastAsia="Aptos" w:hAnsi="Aptos"/>
-          <w:sz w:val="22"/>
-          <w:szCs w:val="22"/>
-        </w:rPr>
-        <w:t xml:space="preserve"> chance of a print at or above consensus.</w:t>
+        <w:t xml:space="preserve">. Every route lands below the lowest Street estimate; our model gives under a 10% chance of a print at or above consensus.</w:t>
       </w:r>
     </w:p>
     <w:p>
@@ -1156,7 +1138,7 @@
           <w:sz w:val="22"/>
           <w:szCs w:val="22"/>
         </w:rPr>
-        <w:t xml:space="preserve"> Nights per active listing have held at ~62.6 since 2022, and stays at existing listings are shrinking (−3% to −7% y/y in 2026).</w:t>
+        <w:t xml:space="preserve"> Nights per active listing have held at ~62.6 since 2022 only because new listings keep coming; stays at existing listings are shrinking (−3% to −7% y/y in 2026).</w:t>
       </w:r>
     </w:p>
     <w:p>
@@ -1257,7 +1239,7 @@
           <w:sz w:val="22"/>
           <w:szCs w:val="22"/>
         </w:rPr>
-        <w:t xml:space="preserve"> against </w:t>
+        <w:t xml:space="preserve"> against North America's </w:t>
       </w:r>
       <w:r>
         <w:rPr>
@@ -1397,7 +1379,7 @@
           <w:sz w:val="22"/>
           <w:szCs w:val="22"/>
         </w:rPr>
-        <w:t xml:space="preserve">Regulators are removing supply where Airbnb is densest</w:t>
+        <w:t xml:space="preserve">Regulators cap supply where Airbnb is densest</w:t>
       </w:r>
       <w:r>
         <w:rPr>
@@ -1423,7 +1405,7 @@
           <w:sz w:val="22"/>
           <w:szCs w:val="22"/>
         </w:rPr>
-        <w:t xml:space="preserve"> listings removed in Spain; Barcelona's licences lapse in 2028), and the new businesses are small: hotels are a single-digit share of nights and ad revenue is zero.</w:t>
+        <w:t xml:space="preserve"> listings removed in Spain; Barcelona in 2028), and new businesses are small: hotels are a single-digit share of nights; ad revenue is zero.</w:t>
       </w:r>
     </w:p>
     <w:p>
@@ -1597,7 +1579,7 @@
           <w:sz w:val="22"/>
           <w:szCs w:val="22"/>
         </w:rPr>
-        <w:t xml:space="preserve"> The Fed resumed hiking on 16 Sep, CPI airfares were +25.5% y/y in July, CoStar sees US hotel RevPAR growth halving from +4.4% (2026) to +2.1% (2027), and Booking guided 3Q26 room nights to +3–5%. We do not lean on it: dearer flights also push travellers toward drive-to trips, where Airbnb is strongest.</w:t>
+        <w:t xml:space="preserve"> The Fed resumed hiking on 16 Sep, CPI airfares were +25.5% y/y in July, and CoStar sees US hotel RevPAR growth halving in 2027 (+2.1%). We do not lean on it: dearer flights also push travellers to drive-to trips, Airbnb's strength.</w:t>
       </w:r>
     </w:p>
     <w:p>
@@ -1639,7 +1621,7 @@
           <w:sz w:val="22"/>
           <w:szCs w:val="22"/>
         </w:rPr>
-        <w:t xml:space="preserve"> nights +9.2% vs +11.5%; a 4Q26 revenue guide below the Street ($3.08bn ours vs $3.16bn), a 4Q26 nights descriptor below "low double digits", and the FY26 floor at risk (ours 34.5%). The stock reprices on nights guidance, not revenue beats: its three largest post-print falls (3Q22 −13.4%, 1Q23 −10.9%, 2Q24 −13.4%) came on revenue beats with nights guided lower. First FY27 cuts follow. </w:t>
+        <w:t xml:space="preserve"> nights +9.2% vs +11.5%; a 4Q26 revenue guide below the Street ($3.08bn ours vs $3.16bn) with nights guided to "high single digits" or lower (Street +9.9%), and the FY26 floor at risk (ours 34.5% on our costs). First FY27 estimate cuts follow. </w:t>
       </w:r>
       <w:r>
         <w:rPr>
@@ -1657,7 +1639,7 @@
           <w:sz w:val="22"/>
           <w:szCs w:val="22"/>
         </w:rPr>
-        <w:t xml:space="preserve"> the 1Q27 guide laps a +17.9% revenue comparison, and management sets its FY27 margin outlook (every February letter since 2023 has carried one); FY27 consensus resets. </w:t>
+        <w:t xml:space="preserve"> the 1Q27 guide laps a +17.9% revenue comparison, and management sets its FY27 margin outlook; FY27 consensus resets. </w:t>
       </w:r>
       <w:r>
         <w:rPr>
@@ -1825,7 +1807,7 @@
           <w:sz w:val="22"/>
           <w:szCs w:val="22"/>
         </w:rPr>
-        <w:t xml:space="preserve">. This is conservative: at ~0.5 turns per point of growth, 4.1pts less FY27 revenue growth justifies ~2 turns.</w:t>
+        <w:t xml:space="preserve">. On NTM, our EBITDA is 12% below consensus and the multiple falls 10% (14.9x → 13.4x); slower growth (FY27 revenue ~4pts below the Street) is what earns the lower multiple.</w:t>
       </w:r>
     </w:p>
     <w:p>
@@ -1888,7 +1870,7 @@
           <w:sz w:val="22"/>
           <w:szCs w:val="22"/>
         </w:rPr>
-        <w:t xml:space="preserve"> not a 12-month catalyst. Airbnb is absent from every AI booking channel launched so far (ChatGPT apps, Oct 2025, "not quite ready" per Chesky; Google AI Mode hotel booking, Aug 2026; Meta's Muse), where Booking, Expedia, Marriott and Hilton are present. Joining means paying for distribution it now gets free (~90% of traffic is direct or unpaid). AI savings are small and being spent: the 2Q26 10-Q credits AI with </w:t>
+        <w:t xml:space="preserve"> an agent is another conversion feature: at best a one-time level shift like the bundle, launching in 2027 and reaching reported nights late in our window. Airbnb is absent from every AI booking channel launched so far (ChatGPT apps, Google AI Mode hotel booking, Meta's Muse) while Booking and Expedia (Vrbo's parent) are in, so Muse is share risk for Airbnb, not upside. Partnering means paying for distribution it now gets free (~90% of traffic is direct or unpaid). We would revisit on a distribution deal with disclosed volume. AI savings are small and being spent: the 2Q26 10-Q credits AI with </w:t>
       </w:r>
       <w:r>
         <w:rPr>
@@ -1924,7 +1906,7 @@
           <w:sz w:val="22"/>
           <w:szCs w:val="22"/>
         </w:rPr>
-        <w:t xml:space="preserve">; management will "reinvest most of these efficiencies", its guide assumes "a material increase" in AI spend, and our model already credits the savings.</w:t>
+        <w:t xml:space="preserve">; management will "reinvest most of these efficiencies" and guides "a material increase" in AI spend; our model credits the savings.</w:t>
       </w:r>
     </w:p>
     <w:p>
@@ -1971,7 +1953,7 @@
           <w:sz w:val="22"/>
           <w:szCs w:val="22"/>
         </w:rPr>
-        <w:t xml:space="preserve"> it moves per-share numbers, not EBITDA or the multiple; ~5% of shares a year is already in our model and consensus; SBC ($1.6bn in FY25) absorbs over a third; authorization days show no excess return, and buying did not step up after the Aug 2025 sell-off.</w:t>
+        <w:t xml:space="preserve"> a reload with the 5 Nov guide would cushion day 1, which is why we do not trade day 1; it moves per-share numbers, not EBITDA or the multiple; ~5% of shares a year is already in our model and consensus; SBC ($1.6bn in FY25) absorbs over a third; and authorization days have shown no excess return.</w:t>
       </w:r>
     </w:p>
     <w:p>
@@ -2018,7 +2000,7 @@
           <w:sz w:val="22"/>
           <w:szCs w:val="22"/>
         </w:rPr>
-        <w:t xml:space="preserve"> no loyalty program exists yet, only tests, and management already guides FY26 take rate "relatively flat" on "higher customer incentives related to new businesses", which is what loyalty perks are. Sponsored listings are unlaunched (analysts expect 2027); even $250M of ad revenue at a 70% margin is ~$175M of EBITDA, a fifth of our $0.93bn FY27 gap.</w:t>
+        <w:t xml:space="preserve"> no loyalty program exists yet, only tests (a launch at a print is a headline risk we size for), and management already guides FY26 take rate "relatively flat" on "higher customer incentives related to new businesses", which is what loyalty perks are. Sponsored listings are unlaunched (analysts expect 2027); even $250M of ad revenue at a 70% margin is ~$175M of EBITDA, a fifth of our $0.93bn FY27 gap.</w:t>
       </w:r>
     </w:p>
     <w:p>
@@ -2047,36 +2029,7 @@
           <w:sz w:val="22"/>
           <w:szCs w:val="22"/>
         </w:rPr>
-        <w:t xml:space="preserve"> we cover if 3Q26 nights print ≥10.3% with 4Q26 guided "low double digits".</w:t>
-      </w:r>
-    </w:p>
-    <w:p>
-      <w:pPr>
-        <w:pStyle w:val="ListParagraph"/>
-        <w:numPr>
-          <w:ilvl w:val="0"/>
-          <w:numId w:val="3"/>
-        </w:numPr>
-        <w:spacing w:after="40" w:line="252"/>
-        <w:jc w:val="both"/>
-      </w:pPr>
-      <w:r>
-        <w:rPr>
-          <w:rFonts w:ascii="Aptos" w:cs="Aptos" w:eastAsia="Aptos" w:hAnsi="Aptos"/>
-          <w:b/>
-          <w:bCs/>
-          <w:sz w:val="22"/>
-          <w:szCs w:val="22"/>
-        </w:rPr>
-        <w:t xml:space="preserve">Timing:</w:t>
-      </w:r>
-      <w:r>
-        <w:rPr>
-          <w:rFonts w:ascii="Aptos" w:cs="Aptos" w:eastAsia="Aptos" w:hAnsi="Aptos"/>
-          <w:sz w:val="22"/>
-          <w:szCs w:val="22"/>
-        </w:rPr>
-        <w:t xml:space="preserve"> February prints were up days in 5 of 6 years; we hold for the estimate cuts, not that day-1 move.</w:t>
+        <w:t xml:space="preserve"> we cover if 3Q26 nights print ≥10.3% and the 4Q26 guide meets the Street ($3.16bn; "low double digits" nights). The 7 Aug post-print close ($178, +18%) marks the upside risk. February prints were up days in 5 of 6 years, so we hold for estimate cuts, not day-1 moves.</w:t>
       </w:r>
     </w:p>
     <w:sectPr>

</xml_diff>